<commit_message>
docs(docx): add 项目架构与技术路线.docx and update 基于ChatGPT...优化.docx with factory architecture section
</commit_message>
<xml_diff>
--- a/基于ChatGPT的患者信息管理与医疗服务优化.docx
+++ b/基于ChatGPT的患者信息管理与医疗服务优化.docx
@@ -1543,6 +1543,320 @@
     </w:p>
     <w:p/>
     <w:p/>
+    <w:p>
+      <w:pPr>
+        <w:pStyle w:val="Heading1"/>
+      </w:pPr>
+      <w:r>
+        <w:rPr>
+          <w:rFonts w:ascii="PingFang SC" w:hAnsi="PingFang SC" w:eastAsia="PingFang SC"/>
+          <w:b/>
+        </w:rPr>
+        <w:t>16. 技术架构概览（重构）</w:t>
+      </w:r>
+    </w:p>
+    <w:p>
+      <w:r>
+        <w:rPr>
+          <w:rFonts w:ascii="PingFang SC" w:hAnsi="PingFang SC" w:eastAsia="PingFang SC"/>
+        </w:rPr>
+        <w:t>为保证本文项目的可靠采集，Python 侧三个爬虫已重构为工厂模式（scrapers/ 包）：ScraperFactory.create(site) 返回绑定解析器的具体 Scraper，共享 BaseScraper 的多进程流水线（JoinableQueue）。</w:t>
+      </w:r>
+    </w:p>
+    <w:p>
+      <w:pPr>
+        <w:pStyle w:val="Heading2"/>
+      </w:pPr>
+      <w:r>
+        <w:rPr>
+          <w:rFonts w:ascii="PingFang SC" w:hAnsi="PingFang SC" w:eastAsia="PingFang SC"/>
+        </w:rPr>
+        <w:t>16.1 站点映射</w:t>
+      </w:r>
+    </w:p>
+    <w:p>
+      <w:r>
+        <w:rPr>
+          <w:rFonts w:ascii="PingFang SC" w:hAnsi="PingFang SC" w:eastAsia="PingFang SC"/>
+        </w:rPr>
+        <w:t>hospital→HospitalScraper/HospitalParser→data/hospital/；medicine→MedicineScraper/MedicineParser→data/medician/；qa→QAScraper/QAParser→data/ques_ans/。</w:t>
+      </w:r>
+    </w:p>
+    <w:p>
+      <w:pPr>
+        <w:pStyle w:val="Heading2"/>
+      </w:pPr>
+      <w:r>
+        <w:rPr>
+          <w:rFonts w:ascii="PingFang SC" w:hAnsi="PingFang SC" w:eastAsia="PingFang SC"/>
+        </w:rPr>
+        <w:t>16.2 运行</w:t>
+      </w:r>
+    </w:p>
+    <w:p>
+      <w:r>
+        <w:rPr>
+          <w:rFonts w:ascii="PingFang SC" w:hAnsi="PingFang SC" w:eastAsia="PingFang SC"/>
+        </w:rPr>
+        <w:t>python run.py hospital|medicine|qa [--processes N]。详见 README 与 docs/architecture.md。</w:t>
+      </w:r>
+    </w:p>
+    <w:tbl>
+      <w:tblPr>
+        <w:tblW w:type="auto" w:w="0"/>
+        <w:tblLook w:firstColumn="1" w:firstRow="1" w:lastColumn="0" w:lastRow="0" w:noHBand="0" w:noVBand="1" w:val="04A0"/>
+        <w:tblBorders>
+          <w:top w:val="single" w:sz="4" w:color="000000"/>
+          <w:left w:val="single" w:sz="4" w:color="000000"/>
+          <w:bottom w:val="single" w:sz="4" w:color="000000"/>
+          <w:right w:val="single" w:sz="4" w:color="000000"/>
+          <w:insideH w:val="single" w:sz="4" w:color="000000"/>
+          <w:insideV w:val="single" w:sz="4" w:color="000000"/>
+        </w:tblBorders>
+      </w:tblPr>
+      <w:tblGrid>
+        <w:gridCol w:w="2340"/>
+        <w:gridCol w:w="2340"/>
+        <w:gridCol w:w="2340"/>
+        <w:gridCol w:w="2340"/>
+      </w:tblGrid>
+      <w:tr>
+        <w:tc>
+          <w:tcPr>
+            <w:tcW w:type="dxa" w:w="2340"/>
+          </w:tcPr>
+          <w:p>
+            <w:r/>
+            <w:r>
+              <w:rPr>
+                <w:rFonts w:ascii="PingFang SC" w:hAnsi="PingFang SC" w:eastAsia="PingFang SC"/>
+                <w:b/>
+              </w:rPr>
+              <w:t>site</w:t>
+            </w:r>
+          </w:p>
+        </w:tc>
+        <w:tc>
+          <w:tcPr>
+            <w:tcW w:type="dxa" w:w="2340"/>
+          </w:tcPr>
+          <w:p>
+            <w:r/>
+            <w:r>
+              <w:rPr>
+                <w:rFonts w:ascii="PingFang SC" w:hAnsi="PingFang SC" w:eastAsia="PingFang SC"/>
+                <w:b/>
+              </w:rPr>
+              <w:t>Scraper</w:t>
+            </w:r>
+          </w:p>
+        </w:tc>
+        <w:tc>
+          <w:tcPr>
+            <w:tcW w:type="dxa" w:w="2340"/>
+          </w:tcPr>
+          <w:p>
+            <w:r/>
+            <w:r>
+              <w:rPr>
+                <w:rFonts w:ascii="PingFang SC" w:hAnsi="PingFang SC" w:eastAsia="PingFang SC"/>
+                <w:b/>
+              </w:rPr>
+              <w:t>Parser</w:t>
+            </w:r>
+          </w:p>
+        </w:tc>
+        <w:tc>
+          <w:tcPr>
+            <w:tcW w:type="dxa" w:w="2340"/>
+          </w:tcPr>
+          <w:p>
+            <w:r/>
+            <w:r>
+              <w:rPr>
+                <w:rFonts w:ascii="PingFang SC" w:hAnsi="PingFang SC" w:eastAsia="PingFang SC"/>
+                <w:b/>
+              </w:rPr>
+              <w:t>输出</w:t>
+            </w:r>
+          </w:p>
+        </w:tc>
+      </w:tr>
+      <w:tr>
+        <w:tc>
+          <w:tcPr>
+            <w:tcW w:type="dxa" w:w="2340"/>
+          </w:tcPr>
+          <w:p>
+            <w:r/>
+            <w:r>
+              <w:rPr>
+                <w:rFonts w:ascii="PingFang SC" w:hAnsi="PingFang SC" w:eastAsia="PingFang SC"/>
+              </w:rPr>
+              <w:t>hospital</w:t>
+            </w:r>
+          </w:p>
+        </w:tc>
+        <w:tc>
+          <w:tcPr>
+            <w:tcW w:type="dxa" w:w="2340"/>
+          </w:tcPr>
+          <w:p>
+            <w:r/>
+            <w:r>
+              <w:rPr>
+                <w:rFonts w:ascii="PingFang SC" w:hAnsi="PingFang SC" w:eastAsia="PingFang SC"/>
+              </w:rPr>
+              <w:t>HospitalScraper</w:t>
+            </w:r>
+          </w:p>
+        </w:tc>
+        <w:tc>
+          <w:tcPr>
+            <w:tcW w:type="dxa" w:w="2340"/>
+          </w:tcPr>
+          <w:p>
+            <w:r/>
+            <w:r>
+              <w:rPr>
+                <w:rFonts w:ascii="PingFang SC" w:hAnsi="PingFang SC" w:eastAsia="PingFang SC"/>
+              </w:rPr>
+              <w:t>HospitalParser</w:t>
+            </w:r>
+          </w:p>
+        </w:tc>
+        <w:tc>
+          <w:tcPr>
+            <w:tcW w:type="dxa" w:w="2340"/>
+          </w:tcPr>
+          <w:p>
+            <w:r/>
+            <w:r>
+              <w:rPr>
+                <w:rFonts w:ascii="PingFang SC" w:hAnsi="PingFang SC" w:eastAsia="PingFang SC"/>
+              </w:rPr>
+              <w:t>data/hospital/</w:t>
+            </w:r>
+          </w:p>
+        </w:tc>
+      </w:tr>
+      <w:tr>
+        <w:tc>
+          <w:tcPr>
+            <w:tcW w:type="dxa" w:w="2340"/>
+          </w:tcPr>
+          <w:p>
+            <w:r/>
+            <w:r>
+              <w:rPr>
+                <w:rFonts w:ascii="PingFang SC" w:hAnsi="PingFang SC" w:eastAsia="PingFang SC"/>
+              </w:rPr>
+              <w:t>medicine</w:t>
+            </w:r>
+          </w:p>
+        </w:tc>
+        <w:tc>
+          <w:tcPr>
+            <w:tcW w:type="dxa" w:w="2340"/>
+          </w:tcPr>
+          <w:p>
+            <w:r/>
+            <w:r>
+              <w:rPr>
+                <w:rFonts w:ascii="PingFang SC" w:hAnsi="PingFang SC" w:eastAsia="PingFang SC"/>
+              </w:rPr>
+              <w:t>MedicineScraper</w:t>
+            </w:r>
+          </w:p>
+        </w:tc>
+        <w:tc>
+          <w:tcPr>
+            <w:tcW w:type="dxa" w:w="2340"/>
+          </w:tcPr>
+          <w:p>
+            <w:r/>
+            <w:r>
+              <w:rPr>
+                <w:rFonts w:ascii="PingFang SC" w:hAnsi="PingFang SC" w:eastAsia="PingFang SC"/>
+              </w:rPr>
+              <w:t>MedicineParser</w:t>
+            </w:r>
+          </w:p>
+        </w:tc>
+        <w:tc>
+          <w:tcPr>
+            <w:tcW w:type="dxa" w:w="2340"/>
+          </w:tcPr>
+          <w:p>
+            <w:r/>
+            <w:r>
+              <w:rPr>
+                <w:rFonts w:ascii="PingFang SC" w:hAnsi="PingFang SC" w:eastAsia="PingFang SC"/>
+              </w:rPr>
+              <w:t>data/medician/</w:t>
+            </w:r>
+          </w:p>
+        </w:tc>
+      </w:tr>
+      <w:tr>
+        <w:tc>
+          <w:tcPr>
+            <w:tcW w:type="dxa" w:w="2340"/>
+          </w:tcPr>
+          <w:p>
+            <w:r/>
+            <w:r>
+              <w:rPr>
+                <w:rFonts w:ascii="PingFang SC" w:hAnsi="PingFang SC" w:eastAsia="PingFang SC"/>
+              </w:rPr>
+              <w:t>qa</w:t>
+            </w:r>
+          </w:p>
+        </w:tc>
+        <w:tc>
+          <w:tcPr>
+            <w:tcW w:type="dxa" w:w="2340"/>
+          </w:tcPr>
+          <w:p>
+            <w:r/>
+            <w:r>
+              <w:rPr>
+                <w:rFonts w:ascii="PingFang SC" w:hAnsi="PingFang SC" w:eastAsia="PingFang SC"/>
+              </w:rPr>
+              <w:t>QAScraper</w:t>
+            </w:r>
+          </w:p>
+        </w:tc>
+        <w:tc>
+          <w:tcPr>
+            <w:tcW w:type="dxa" w:w="2340"/>
+          </w:tcPr>
+          <w:p>
+            <w:r/>
+            <w:r>
+              <w:rPr>
+                <w:rFonts w:ascii="PingFang SC" w:hAnsi="PingFang SC" w:eastAsia="PingFang SC"/>
+              </w:rPr>
+              <w:t>QAParser</w:t>
+            </w:r>
+          </w:p>
+        </w:tc>
+        <w:tc>
+          <w:tcPr>
+            <w:tcW w:type="dxa" w:w="2340"/>
+          </w:tcPr>
+          <w:p>
+            <w:r/>
+            <w:r>
+              <w:rPr>
+                <w:rFonts w:ascii="PingFang SC" w:hAnsi="PingFang SC" w:eastAsia="PingFang SC"/>
+              </w:rPr>
+              <w:t>data/ques_ans/</w:t>
+            </w:r>
+          </w:p>
+        </w:tc>
+      </w:tr>
+    </w:tbl>
     <w:p>
       <w:pPr>
         <w:pStyle w:val="Heading1"/>

</xml_diff>